<commit_message>
Update author order and affiliations
Author order: Nusrat Zahan Jarin, Obaidur Rahman, Rezwan Ahmed, with matching affiliation numbers in
the manuscript, Supplementary Information, full-length article and citation file.
</commit_message>
<xml_diff>
--- a/paper/Supplementary_Information.docx
+++ b/paper/Supplementary_Information.docx
@@ -25,7 +25,7 @@
         <w:rPr>
           <w:b/>
         </w:rPr>
-        <w:t>Rezwan Ahmed</w:t>
+        <w:t>Nusrat Zahan Jarin</w:t>
       </w:r>
       <w:r>
         <w:rPr>
@@ -38,7 +38,7 @@
         <w:rPr>
           <w:b/>
         </w:rPr>
-        <w:t>, Nusrat Zahan Jarin</w:t>
+        <w:t>, Obaidur Rahman</w:t>
       </w:r>
       <w:r>
         <w:rPr>
@@ -51,7 +51,7 @@
         <w:rPr>
           <w:b/>
         </w:rPr>
-        <w:t>, Obaidur Rahman</w:t>
+        <w:t>, Rezwan Ahmed</w:t>
       </w:r>
       <w:r>
         <w:rPr>
@@ -70,7 +70,7 @@
       </w:r>
       <w:r>
         <w:rPr/>
-        <w:t xml:space="preserve">Department of Geography and Environment, University of Dhaka, Dhaka, Bangladesh. </w:t>
+        <w:t xml:space="preserve">Department of Geography, University of California, Santa Barbara, CA, USA. </w:t>
       </w:r>
       <w:r>
         <w:rPr>
@@ -80,7 +80,7 @@
       </w:r>
       <w:r>
         <w:rPr/>
-        <w:t xml:space="preserve">Department of Geography, University of California, Santa Barbara, CA, USA. </w:t>
+        <w:t xml:space="preserve">Department of Geography, Oklahoma State University, Stillwater, OK, USA. </w:t>
       </w:r>
       <w:r>
         <w:rPr>
@@ -90,7 +90,7 @@
       </w:r>
       <w:r>
         <w:rPr/>
-        <w:t>Department of Geography, Oklahoma State University, Stillwater, OK, USA.</w:t>
+        <w:t>Department of Geography and Environment, University of Dhaka, Dhaka, Bangladesh.</w:t>
       </w:r>
     </w:p>
     <w:p>

</xml_diff>

<commit_message>
Retitle the study and correct the Kali Khola base-flow source
The study is now titled "How high above the river is safe? Building
destruction along the 207-km path of Nepal's 2026 flood" (README,
CITATION.cff, manuscript, Supplementary Information, full-length article).

- Kali Khola: the peak of 12.3 m is from the CHWRR report, but the
  base-flow level of about 3.2 m comes from the real-time record of the
  Department of Hydrology and Meteorology (19 October 2026). Both are now
  cited, and the downstream values are described as peak stages above
  base flow. No numbers change; the legend of the height-envelope figure
  is relabeled to match.
- Supplementary Table 1 gives the temporal resolution of each dataset.
- Complete the author list of Maharjan et al. (2021).
- scripts/build_si_document.py builds the Supplementary Information for
  the full-length article, numbered in the order the article cites it.
</commit_message>
<xml_diff>
--- a/paper/Supplementary_Information.docx
+++ b/paper/Supplementary_Information.docx
@@ -17,7 +17,7 @@
       </w:pPr>
       <w:r>
         <w:rPr/>
-        <w:t>What height is safe? An analysis of building destruction along the 207-km path of Nepal's 2026 flood</w:t>
+        <w:t>How high above the river is safe? Building destruction along the 207-km path of Nepal's 2026 flood</w:t>
       </w:r>
     </w:p>
     <w:p>
@@ -231,7 +231,17 @@
     <w:p>
       <w:r>
         <w:rPr/>
-        <w:t>Three limitations of access shaped the design. Gauge observations of the Department of Hydrology and Meteorology could not be retrieved because the public interface requires an application key, so stage rises were taken from the CHWRR report. HOT, UNDP and UNOSAT layers carry no product-specific redistribution licence; they are cited and archived for verification but should not be republished until permission is confirmed. Planet imagery is released for non-commercial use only and was not used.</w:t>
+        <w:t xml:space="preserve">Three limitations of access shaped the design. Historical gauge observations of the Department of Hydrology and Meteorology could not be retrieved because the public interface requires an application key, so peak stages were taken from the CHWRR report and the ICIMOD synthesis </w:t>
+      </w:r>
+      <w:r>
+        <w:rPr>
+          <w:vertAlign w:val="superscript"/>
+        </w:rPr>
+        <w:t>5,15</w:t>
+      </w:r>
+      <w:r>
+        <w:rPr/>
+        <w:t>. The only DHM value used is the post-monsoon level at Kali Khola, read from the public real-time feed on 19 October 2026, which serves as the base-flow reference at that gauge. HOT, UNDP and UNOSAT layers carry no product-specific redistribution licence; they are cited and archived for verification but should not be republished until permission is confirmed. Planet imagery is released for non-commercial use only and was not used.</w:t>
       </w:r>
     </w:p>
     <w:p>
@@ -353,7 +363,7 @@
         <w:rPr>
           <w:vertAlign w:val="superscript"/>
         </w:rPr>
-        <w:t>15</w:t>
+        <w:t>16</w:t>
       </w:r>
       <w:r>
         <w:rPr/>
@@ -388,7 +398,7 @@
         <w:rPr>
           <w:vertAlign w:val="superscript"/>
         </w:rPr>
-        <w:t>16,17</w:t>
+        <w:t>17,18</w:t>
       </w:r>
       <w:r>
         <w:rPr/>
@@ -404,7 +414,7 @@
         <w:rPr>
           <w:vertAlign w:val="superscript"/>
         </w:rPr>
-        <w:t>18</w:t>
+        <w:t>19</w:t>
       </w:r>
       <w:r>
         <w:rPr/>
@@ -450,7 +460,7 @@
         <w:rPr>
           <w:vertAlign w:val="superscript"/>
         </w:rPr>
-        <w:t>3,7,19</w:t>
+        <w:t>3,7,20</w:t>
       </w:r>
       <w:r>
         <w:rPr/>
@@ -486,7 +496,7 @@
         <w:rPr>
           <w:sz w:val="19"/>
         </w:rPr>
-        <w:t xml:space="preserve"> Datasets used in this study, with version, date, resolution, use and access. Retrieval logs with URLs, dates and SHA-256 checksums accompany the code.</w:t>
+        <w:t xml:space="preserve"> Datasets used in this study, with version, date and temporal resolution, spatial resolution, use and access. Retrieval logs with URLs, dates and SHA-256 checksums accompany the code.</w:t>
       </w:r>
     </w:p>
     <w:tbl>
@@ -498,12 +508,12 @@
         <w:tblLook w:firstColumn="1" w:firstRow="1" w:lastColumn="0" w:lastRow="0" w:noHBand="0" w:noVBand="1" w:val="04A0"/>
       </w:tblPr>
       <w:tblGrid>
-        <w:gridCol w:w="1415"/>
-        <w:gridCol w:w="1547"/>
-        <w:gridCol w:w="1125"/>
-        <w:gridCol w:w="1205"/>
-        <w:gridCol w:w="1310"/>
-        <w:gridCol w:w="2568"/>
+        <w:gridCol w:w="1400"/>
+        <w:gridCol w:w="1533"/>
+        <w:gridCol w:w="1192"/>
+        <w:gridCol w:w="1188"/>
+        <w:gridCol w:w="1294"/>
+        <w:gridCol w:w="2563"/>
       </w:tblGrid>
       <w:tr>
         <w:trPr>
@@ -512,7 +522,7 @@
         </w:trPr>
         <w:tc>
           <w:tcPr>
-            <w:tcW w:type="dxa" w:w="1415"/>
+            <w:tcW w:type="dxa" w:w="1400"/>
             <w:shd w:val="clear" w:fill="E6EEF2"/>
           </w:tcPr>
           <w:p>
@@ -531,7 +541,7 @@
         </w:tc>
         <w:tc>
           <w:tcPr>
-            <w:tcW w:type="dxa" w:w="1547"/>
+            <w:tcW w:type="dxa" w:w="1533"/>
             <w:shd w:val="clear" w:fill="E6EEF2"/>
           </w:tcPr>
           <w:p>
@@ -550,7 +560,7 @@
         </w:tc>
         <w:tc>
           <w:tcPr>
-            <w:tcW w:type="dxa" w:w="1125"/>
+            <w:tcW w:type="dxa" w:w="1192"/>
             <w:shd w:val="clear" w:fill="E6EEF2"/>
           </w:tcPr>
           <w:p>
@@ -563,13 +573,13 @@
                 <w:b/>
                 <w:sz w:val="14"/>
               </w:rPr>
-              <w:t>Date or epoch</w:t>
-            </w:r>
-          </w:p>
-        </w:tc>
-        <w:tc>
-          <w:tcPr>
-            <w:tcW w:type="dxa" w:w="1205"/>
+              <w:t>Date and temporal resolution</w:t>
+            </w:r>
+          </w:p>
+        </w:tc>
+        <w:tc>
+          <w:tcPr>
+            <w:tcW w:type="dxa" w:w="1188"/>
             <w:shd w:val="clear" w:fill="E6EEF2"/>
           </w:tcPr>
           <w:p>
@@ -588,7 +598,7 @@
         </w:tc>
         <w:tc>
           <w:tcPr>
-            <w:tcW w:type="dxa" w:w="1310"/>
+            <w:tcW w:type="dxa" w:w="1294"/>
             <w:shd w:val="clear" w:fill="E6EEF2"/>
           </w:tcPr>
           <w:p>
@@ -607,7 +617,7 @@
         </w:tc>
         <w:tc>
           <w:tcPr>
-            <w:tcW w:type="dxa" w:w="2568"/>
+            <w:tcW w:type="dxa" w:w="2563"/>
             <w:shd w:val="clear" w:fill="E6EEF2"/>
           </w:tcPr>
           <w:p>
@@ -631,7 +641,7 @@
         </w:trPr>
         <w:tc>
           <w:tcPr>
-            <w:tcW w:type="dxa" w:w="1415"/>
+            <w:tcW w:type="dxa" w:w="1400"/>
           </w:tcPr>
           <w:p>
             <w:pPr>
@@ -647,7 +657,7 @@
         </w:tc>
         <w:tc>
           <w:tcPr>
-            <w:tcW w:type="dxa" w:w="1547"/>
+            <w:tcW w:type="dxa" w:w="1533"/>
           </w:tcPr>
           <w:p>
             <w:pPr>
@@ -663,7 +673,7 @@
         </w:tc>
         <w:tc>
           <w:tcPr>
-            <w:tcW w:type="dxa" w:w="1125"/>
+            <w:tcW w:type="dxa" w:w="1192"/>
           </w:tcPr>
           <w:p>
             <w:pPr>
@@ -673,13 +683,13 @@
               <w:rPr>
                 <w:sz w:val="14"/>
               </w:rPr>
-              <w:t>Post-event imagery; acquisition times not published</w:t>
-            </w:r>
-          </w:p>
-        </w:tc>
-        <w:tc>
-          <w:tcPr>
-            <w:tcW w:type="dxa" w:w="1205"/>
+              <w:t>Post-event imagery; acquisition times not published; single post-event inventory</w:t>
+            </w:r>
+          </w:p>
+        </w:tc>
+        <w:tc>
+          <w:tcPr>
+            <w:tcW w:type="dxa" w:w="1188"/>
           </w:tcPr>
           <w:p>
             <w:pPr>
@@ -708,7 +718,7 @@
         </w:tc>
         <w:tc>
           <w:tcPr>
-            <w:tcW w:type="dxa" w:w="1310"/>
+            <w:tcW w:type="dxa" w:w="1294"/>
           </w:tcPr>
           <w:p>
             <w:pPr>
@@ -724,7 +734,7 @@
         </w:tc>
         <w:tc>
           <w:tcPr>
-            <w:tcW w:type="dxa" w:w="2568"/>
+            <w:tcW w:type="dxa" w:w="2563"/>
           </w:tcPr>
           <w:p>
             <w:pPr>
@@ -755,7 +765,7 @@
         </w:trPr>
         <w:tc>
           <w:tcPr>
-            <w:tcW w:type="dxa" w:w="1415"/>
+            <w:tcW w:type="dxa" w:w="1400"/>
           </w:tcPr>
           <w:p>
             <w:pPr>
@@ -771,7 +781,7 @@
         </w:tc>
         <w:tc>
           <w:tcPr>
-            <w:tcW w:type="dxa" w:w="1547"/>
+            <w:tcW w:type="dxa" w:w="1533"/>
           </w:tcPr>
           <w:p>
             <w:pPr>
@@ -787,7 +797,7 @@
         </w:tc>
         <w:tc>
           <w:tcPr>
-            <w:tcW w:type="dxa" w:w="1125"/>
+            <w:tcW w:type="dxa" w:w="1192"/>
           </w:tcPr>
           <w:p>
             <w:pPr>
@@ -797,13 +807,13 @@
               <w:rPr>
                 <w:sz w:val="14"/>
               </w:rPr>
-              <w:t>Imagery 27 Aug–5 Sep 2026</w:t>
-            </w:r>
-          </w:p>
-        </w:tc>
-        <w:tc>
-          <w:tcPr>
-            <w:tcW w:type="dxa" w:w="1205"/>
+              <w:t>Imagery 27 Aug–5 Sep 2026; one graded snapshot per AOI (latest product used)</w:t>
+            </w:r>
+          </w:p>
+        </w:tc>
+        <w:tc>
+          <w:tcPr>
+            <w:tcW w:type="dxa" w:w="1188"/>
           </w:tcPr>
           <w:p>
             <w:pPr>
@@ -819,7 +829,7 @@
         </w:tc>
         <w:tc>
           <w:tcPr>
-            <w:tcW w:type="dxa" w:w="1310"/>
+            <w:tcW w:type="dxa" w:w="1294"/>
           </w:tcPr>
           <w:p>
             <w:pPr>
@@ -835,7 +845,7 @@
         </w:tc>
         <w:tc>
           <w:tcPr>
-            <w:tcW w:type="dxa" w:w="2568"/>
+            <w:tcW w:type="dxa" w:w="2563"/>
           </w:tcPr>
           <w:p>
             <w:pPr>
@@ -866,7 +876,7 @@
         </w:trPr>
         <w:tc>
           <w:tcPr>
-            <w:tcW w:type="dxa" w:w="1415"/>
+            <w:tcW w:type="dxa" w:w="1400"/>
           </w:tcPr>
           <w:p>
             <w:pPr>
@@ -882,7 +892,7 @@
         </w:tc>
         <w:tc>
           <w:tcPr>
-            <w:tcW w:type="dxa" w:w="1547"/>
+            <w:tcW w:type="dxa" w:w="1533"/>
           </w:tcPr>
           <w:p>
             <w:pPr>
@@ -898,7 +908,7 @@
         </w:tc>
         <w:tc>
           <w:tcPr>
-            <w:tcW w:type="dxa" w:w="1125"/>
+            <w:tcW w:type="dxa" w:w="1192"/>
           </w:tcPr>
           <w:p>
             <w:pPr>
@@ -908,13 +918,13 @@
               <w:rPr>
                 <w:sz w:val="14"/>
               </w:rPr>
-              <w:t>StoryMap of 27 Aug, updated 2 Sep 2026</w:t>
-            </w:r>
-          </w:p>
-        </w:tc>
-        <w:tc>
-          <w:tcPr>
-            <w:tcW w:type="dxa" w:w="1205"/>
+              <w:t>StoryMap of 27 Aug, updated 2 Sep 2026; event-based updates, snapshot retrieved 9 Sep 2026</w:t>
+            </w:r>
+          </w:p>
+        </w:tc>
+        <w:tc>
+          <w:tcPr>
+            <w:tcW w:type="dxa" w:w="1188"/>
           </w:tcPr>
           <w:p>
             <w:pPr>
@@ -930,7 +940,7 @@
         </w:tc>
         <w:tc>
           <w:tcPr>
-            <w:tcW w:type="dxa" w:w="1310"/>
+            <w:tcW w:type="dxa" w:w="1294"/>
           </w:tcPr>
           <w:p>
             <w:pPr>
@@ -946,7 +956,7 @@
         </w:tc>
         <w:tc>
           <w:tcPr>
-            <w:tcW w:type="dxa" w:w="2568"/>
+            <w:tcW w:type="dxa" w:w="2563"/>
           </w:tcPr>
           <w:p>
             <w:pPr>
@@ -977,7 +987,7 @@
         </w:trPr>
         <w:tc>
           <w:tcPr>
-            <w:tcW w:type="dxa" w:w="1415"/>
+            <w:tcW w:type="dxa" w:w="1400"/>
           </w:tcPr>
           <w:p>
             <w:pPr>
@@ -993,7 +1003,7 @@
         </w:tc>
         <w:tc>
           <w:tcPr>
-            <w:tcW w:type="dxa" w:w="1547"/>
+            <w:tcW w:type="dxa" w:w="1533"/>
           </w:tcPr>
           <w:p>
             <w:pPr>
@@ -1009,7 +1019,7 @@
         </w:tc>
         <w:tc>
           <w:tcPr>
-            <w:tcW w:type="dxa" w:w="1125"/>
+            <w:tcW w:type="dxa" w:w="1192"/>
           </w:tcPr>
           <w:p>
             <w:pPr>
@@ -1019,13 +1029,13 @@
               <w:rPr>
                 <w:sz w:val="14"/>
               </w:rPr>
-              <w:t>Reference date 31 Aug 2026</w:t>
-            </w:r>
-          </w:p>
-        </w:tc>
-        <w:tc>
-          <w:tcPr>
-            <w:tcW w:type="dxa" w:w="1205"/>
+              <w:t>Reference date 31 Aug 2026; single estimate</w:t>
+            </w:r>
+          </w:p>
+        </w:tc>
+        <w:tc>
+          <w:tcPr>
+            <w:tcW w:type="dxa" w:w="1188"/>
           </w:tcPr>
           <w:p>
             <w:pPr>
@@ -1041,7 +1051,7 @@
         </w:tc>
         <w:tc>
           <w:tcPr>
-            <w:tcW w:type="dxa" w:w="1310"/>
+            <w:tcW w:type="dxa" w:w="1294"/>
           </w:tcPr>
           <w:p>
             <w:pPr>
@@ -1057,7 +1067,7 @@
         </w:tc>
         <w:tc>
           <w:tcPr>
-            <w:tcW w:type="dxa" w:w="2568"/>
+            <w:tcW w:type="dxa" w:w="2563"/>
           </w:tcPr>
           <w:p>
             <w:pPr>
@@ -1088,7 +1098,7 @@
         </w:trPr>
         <w:tc>
           <w:tcPr>
-            <w:tcW w:type="dxa" w:w="1415"/>
+            <w:tcW w:type="dxa" w:w="1400"/>
           </w:tcPr>
           <w:p>
             <w:pPr>
@@ -1104,7 +1114,7 @@
         </w:tc>
         <w:tc>
           <w:tcPr>
-            <w:tcW w:type="dxa" w:w="1547"/>
+            <w:tcW w:type="dxa" w:w="1533"/>
           </w:tcPr>
           <w:p>
             <w:pPr>
@@ -1120,7 +1130,7 @@
         </w:tc>
         <w:tc>
           <w:tcPr>
-            <w:tcW w:type="dxa" w:w="1125"/>
+            <w:tcW w:type="dxa" w:w="1192"/>
           </w:tcPr>
           <w:p>
             <w:pPr>
@@ -1130,13 +1140,13 @@
               <w:rPr>
                 <w:sz w:val="14"/>
               </w:rPr>
-              <w:t>Imagery 26–27 Aug 2026</w:t>
-            </w:r>
-          </w:p>
-        </w:tc>
-        <w:tc>
-          <w:tcPr>
-            <w:tcW w:type="dxa" w:w="1205"/>
+              <w:t>Imagery 26–27 Aug 2026; single post-event extent</w:t>
+            </w:r>
+          </w:p>
+        </w:tc>
+        <w:tc>
+          <w:tcPr>
+            <w:tcW w:type="dxa" w:w="1188"/>
           </w:tcPr>
           <w:p>
             <w:pPr>
@@ -1178,7 +1188,7 @@
         </w:tc>
         <w:tc>
           <w:tcPr>
-            <w:tcW w:type="dxa" w:w="1310"/>
+            <w:tcW w:type="dxa" w:w="1294"/>
           </w:tcPr>
           <w:p>
             <w:pPr>
@@ -1194,7 +1204,7 @@
         </w:tc>
         <w:tc>
           <w:tcPr>
-            <w:tcW w:type="dxa" w:w="2568"/>
+            <w:tcW w:type="dxa" w:w="2563"/>
           </w:tcPr>
           <w:p>
             <w:pPr>
@@ -1225,7 +1235,7 @@
         </w:trPr>
         <w:tc>
           <w:tcPr>
-            <w:tcW w:type="dxa" w:w="1415"/>
+            <w:tcW w:type="dxa" w:w="1400"/>
           </w:tcPr>
           <w:p>
             <w:pPr>
@@ -1241,7 +1251,7 @@
         </w:tc>
         <w:tc>
           <w:tcPr>
-            <w:tcW w:type="dxa" w:w="1547"/>
+            <w:tcW w:type="dxa" w:w="1533"/>
           </w:tcPr>
           <w:p>
             <w:pPr>
@@ -1257,7 +1267,7 @@
         </w:tc>
         <w:tc>
           <w:tcPr>
-            <w:tcW w:type="dxa" w:w="1125"/>
+            <w:tcW w:type="dxa" w:w="1192"/>
           </w:tcPr>
           <w:p>
             <w:pPr>
@@ -1267,13 +1277,13 @@
               <w:rPr>
                 <w:sz w:val="14"/>
               </w:rPr>
-              <w:t>26 Aug–3 Oct 2026</w:t>
-            </w:r>
-          </w:p>
-        </w:tc>
-        <w:tc>
-          <w:tcPr>
-            <w:tcW w:type="dxa" w:w="1205"/>
+              <w:t>26 Aug–3 Oct 2026; near-daily situation reports</w:t>
+            </w:r>
+          </w:p>
+        </w:tc>
+        <w:tc>
+          <w:tcPr>
+            <w:tcW w:type="dxa" w:w="1188"/>
           </w:tcPr>
           <w:p>
             <w:pPr>
@@ -1289,7 +1299,7 @@
         </w:tc>
         <w:tc>
           <w:tcPr>
-            <w:tcW w:type="dxa" w:w="1310"/>
+            <w:tcW w:type="dxa" w:w="1294"/>
           </w:tcPr>
           <w:p>
             <w:pPr>
@@ -1305,7 +1315,7 @@
         </w:tc>
         <w:tc>
           <w:tcPr>
-            <w:tcW w:type="dxa" w:w="2568"/>
+            <w:tcW w:type="dxa" w:w="2563"/>
           </w:tcPr>
           <w:p>
             <w:pPr>
@@ -1330,7 +1340,7 @@
         </w:trPr>
         <w:tc>
           <w:tcPr>
-            <w:tcW w:type="dxa" w:w="1415"/>
+            <w:tcW w:type="dxa" w:w="1400"/>
           </w:tcPr>
           <w:p>
             <w:pPr>
@@ -1346,7 +1356,7 @@
         </w:tc>
         <w:tc>
           <w:tcPr>
-            <w:tcW w:type="dxa" w:w="1547"/>
+            <w:tcW w:type="dxa" w:w="1533"/>
           </w:tcPr>
           <w:p>
             <w:pPr>
@@ -1362,7 +1372,7 @@
         </w:tc>
         <w:tc>
           <w:tcPr>
-            <w:tcW w:type="dxa" w:w="1125"/>
+            <w:tcW w:type="dxa" w:w="1192"/>
           </w:tcPr>
           <w:p>
             <w:pPr>
@@ -1372,13 +1382,13 @@
               <w:rPr>
                 <w:sz w:val="14"/>
               </w:rPr>
-              <w:t>10 Sep 2026</w:t>
-            </w:r>
-          </w:p>
-        </w:tc>
-        <w:tc>
-          <w:tcPr>
-            <w:tcW w:type="dxa" w:w="1205"/>
+              <w:t>10 Sep 2026; single assessment</w:t>
+            </w:r>
+          </w:p>
+        </w:tc>
+        <w:tc>
+          <w:tcPr>
+            <w:tcW w:type="dxa" w:w="1188"/>
           </w:tcPr>
           <w:p>
             <w:pPr>
@@ -1394,7 +1404,7 @@
         </w:tc>
         <w:tc>
           <w:tcPr>
-            <w:tcW w:type="dxa" w:w="1310"/>
+            <w:tcW w:type="dxa" w:w="1294"/>
           </w:tcPr>
           <w:p>
             <w:pPr>
@@ -1410,7 +1420,7 @@
         </w:tc>
         <w:tc>
           <w:tcPr>
-            <w:tcW w:type="dxa" w:w="2568"/>
+            <w:tcW w:type="dxa" w:w="2563"/>
           </w:tcPr>
           <w:p>
             <w:pPr>
@@ -1435,7 +1445,7 @@
         </w:trPr>
         <w:tc>
           <w:tcPr>
-            <w:tcW w:type="dxa" w:w="1415"/>
+            <w:tcW w:type="dxa" w:w="1400"/>
           </w:tcPr>
           <w:p>
             <w:pPr>
@@ -1451,7 +1461,7 @@
         </w:tc>
         <w:tc>
           <w:tcPr>
-            <w:tcW w:type="dxa" w:w="1547"/>
+            <w:tcW w:type="dxa" w:w="1533"/>
           </w:tcPr>
           <w:p>
             <w:pPr>
@@ -1467,7 +1477,7 @@
         </w:tc>
         <w:tc>
           <w:tcPr>
-            <w:tcW w:type="dxa" w:w="1125"/>
+            <w:tcW w:type="dxa" w:w="1192"/>
           </w:tcPr>
           <w:p>
             <w:pPr>
@@ -1477,13 +1487,13 @@
               <w:rPr>
                 <w:sz w:val="14"/>
               </w:rPr>
-              <w:t>26 Aug 2026</w:t>
-            </w:r>
-          </w:p>
-        </w:tc>
-        <w:tc>
-          <w:tcPr>
-            <w:tcW w:type="dxa" w:w="1205"/>
+              <w:t>26 Aug 2026; event times to the nearest minute</w:t>
+            </w:r>
+          </w:p>
+        </w:tc>
+        <w:tc>
+          <w:tcPr>
+            <w:tcW w:type="dxa" w:w="1188"/>
           </w:tcPr>
           <w:p>
             <w:pPr>
@@ -1499,7 +1509,7 @@
         </w:tc>
         <w:tc>
           <w:tcPr>
-            <w:tcW w:type="dxa" w:w="1310"/>
+            <w:tcW w:type="dxa" w:w="1294"/>
           </w:tcPr>
           <w:p>
             <w:pPr>
@@ -1509,13 +1519,13 @@
               <w:rPr>
                 <w:sz w:val="14"/>
               </w:rPr>
-              <w:t>Wave timing, stage rises</w:t>
-            </w:r>
-          </w:p>
-        </w:tc>
-        <w:tc>
-          <w:tcPr>
-            <w:tcW w:type="dxa" w:w="2568"/>
+              <w:t>Wave timing, peak stages</w:t>
+            </w:r>
+          </w:p>
+        </w:tc>
+        <w:tc>
+          <w:tcPr>
+            <w:tcW w:type="dxa" w:w="2563"/>
           </w:tcPr>
           <w:p>
             <w:pPr>
@@ -1540,7 +1550,7 @@
         </w:trPr>
         <w:tc>
           <w:tcPr>
-            <w:tcW w:type="dxa" w:w="1415"/>
+            <w:tcW w:type="dxa" w:w="1400"/>
           </w:tcPr>
           <w:p>
             <w:pPr>
@@ -1556,7 +1566,7 @@
         </w:tc>
         <w:tc>
           <w:tcPr>
-            <w:tcW w:type="dxa" w:w="1547"/>
+            <w:tcW w:type="dxa" w:w="1533"/>
           </w:tcPr>
           <w:p>
             <w:pPr>
@@ -1572,7 +1582,7 @@
         </w:tc>
         <w:tc>
           <w:tcPr>
-            <w:tcW w:type="dxa" w:w="1125"/>
+            <w:tcW w:type="dxa" w:w="1192"/>
           </w:tcPr>
           <w:p>
             <w:pPr>
@@ -1582,13 +1592,13 @@
               <w:rPr>
                 <w:sz w:val="14"/>
               </w:rPr>
-              <w:t>28 Aug 2026</w:t>
-            </w:r>
-          </w:p>
-        </w:tc>
-        <w:tc>
-          <w:tcPr>
-            <w:tcW w:type="dxa" w:w="1205"/>
+              <w:t>28 Aug 2026; single report</w:t>
+            </w:r>
+          </w:p>
+        </w:tc>
+        <w:tc>
+          <w:tcPr>
+            <w:tcW w:type="dxa" w:w="1188"/>
           </w:tcPr>
           <w:p>
             <w:pPr>
@@ -1604,7 +1614,7 @@
         </w:tc>
         <w:tc>
           <w:tcPr>
-            <w:tcW w:type="dxa" w:w="1310"/>
+            <w:tcW w:type="dxa" w:w="1294"/>
           </w:tcPr>
           <w:p>
             <w:pPr>
@@ -1620,7 +1630,7 @@
         </w:tc>
         <w:tc>
           <w:tcPr>
-            <w:tcW w:type="dxa" w:w="2568"/>
+            <w:tcW w:type="dxa" w:w="2563"/>
           </w:tcPr>
           <w:p>
             <w:pPr>
@@ -1645,7 +1655,7 @@
         </w:trPr>
         <w:tc>
           <w:tcPr>
-            <w:tcW w:type="dxa" w:w="1415"/>
+            <w:tcW w:type="dxa" w:w="1400"/>
           </w:tcPr>
           <w:p>
             <w:pPr>
@@ -1661,7 +1671,7 @@
         </w:tc>
         <w:tc>
           <w:tcPr>
-            <w:tcW w:type="dxa" w:w="1547"/>
+            <w:tcW w:type="dxa" w:w="1533"/>
           </w:tcPr>
           <w:p>
             <w:pPr>
@@ -1677,7 +1687,7 @@
         </w:tc>
         <w:tc>
           <w:tcPr>
-            <w:tcW w:type="dxa" w:w="1125"/>
+            <w:tcW w:type="dxa" w:w="1192"/>
           </w:tcPr>
           <w:p>
             <w:pPr>
@@ -1687,13 +1697,13 @@
               <w:rPr>
                 <w:sz w:val="14"/>
               </w:rPr>
-              <w:t>Data acquired 2011–2015</w:t>
-            </w:r>
-          </w:p>
-        </w:tc>
-        <w:tc>
-          <w:tcPr>
-            <w:tcW w:type="dxa" w:w="1205"/>
+              <w:t>Data acquired 2011–2015; single static epoch</w:t>
+            </w:r>
+          </w:p>
+        </w:tc>
+        <w:tc>
+          <w:tcPr>
+            <w:tcW w:type="dxa" w:w="1188"/>
           </w:tcPr>
           <w:p>
             <w:pPr>
@@ -1709,7 +1719,7 @@
         </w:tc>
         <w:tc>
           <w:tcPr>
-            <w:tcW w:type="dxa" w:w="1310"/>
+            <w:tcW w:type="dxa" w:w="1294"/>
           </w:tcPr>
           <w:p>
             <w:pPr>
@@ -1725,7 +1735,7 @@
         </w:tc>
         <w:tc>
           <w:tcPr>
-            <w:tcW w:type="dxa" w:w="2568"/>
+            <w:tcW w:type="dxa" w:w="2563"/>
           </w:tcPr>
           <w:p>
             <w:pPr>
@@ -1756,7 +1766,7 @@
         </w:trPr>
         <w:tc>
           <w:tcPr>
-            <w:tcW w:type="dxa" w:w="1415"/>
+            <w:tcW w:type="dxa" w:w="1400"/>
           </w:tcPr>
           <w:p>
             <w:pPr>
@@ -1772,7 +1782,7 @@
         </w:tc>
         <w:tc>
           <w:tcPr>
-            <w:tcW w:type="dxa" w:w="1547"/>
+            <w:tcW w:type="dxa" w:w="1533"/>
           </w:tcPr>
           <w:p>
             <w:pPr>
@@ -1788,7 +1798,7 @@
         </w:tc>
         <w:tc>
           <w:tcPr>
-            <w:tcW w:type="dxa" w:w="1125"/>
+            <w:tcW w:type="dxa" w:w="1192"/>
           </w:tcPr>
           <w:p>
             <w:pPr>
@@ -1798,13 +1808,13 @@
               <w:rPr>
                 <w:sz w:val="14"/>
               </w:rPr>
-              <w:t>2025-10-11 to 2025-10-26 (14 scenes); 2026-09-21 to 2026-10-18 (19 scenes)</w:t>
-            </w:r>
-          </w:p>
-        </w:tc>
-        <w:tc>
-          <w:tcPr>
-            <w:tcW w:type="dxa" w:w="1205"/>
+              <w:t>2025-10-11 to 2025-10-26 (14 scenes); 2026-09-21 to 2026-10-18 (19 scenes); 5-day revisit, combined into one pre-event and one post-event composite</w:t>
+            </w:r>
+          </w:p>
+        </w:tc>
+        <w:tc>
+          <w:tcPr>
+            <w:tcW w:type="dxa" w:w="1188"/>
           </w:tcPr>
           <w:p>
             <w:pPr>
@@ -1820,7 +1830,7 @@
         </w:tc>
         <w:tc>
           <w:tcPr>
-            <w:tcW w:type="dxa" w:w="1310"/>
+            <w:tcW w:type="dxa" w:w="1294"/>
           </w:tcPr>
           <w:p>
             <w:pPr>
@@ -1836,7 +1846,7 @@
         </w:tc>
         <w:tc>
           <w:tcPr>
-            <w:tcW w:type="dxa" w:w="2568"/>
+            <w:tcW w:type="dxa" w:w="2563"/>
           </w:tcPr>
           <w:p>
             <w:pPr>
@@ -1867,7 +1877,7 @@
         </w:trPr>
         <w:tc>
           <w:tcPr>
-            <w:tcW w:type="dxa" w:w="1415"/>
+            <w:tcW w:type="dxa" w:w="1400"/>
           </w:tcPr>
           <w:p>
             <w:pPr>
@@ -1883,7 +1893,7 @@
         </w:tc>
         <w:tc>
           <w:tcPr>
-            <w:tcW w:type="dxa" w:w="1547"/>
+            <w:tcW w:type="dxa" w:w="1533"/>
           </w:tcPr>
           <w:p>
             <w:pPr>
@@ -1899,7 +1909,7 @@
         </w:tc>
         <w:tc>
           <w:tcPr>
-            <w:tcW w:type="dxa" w:w="1125"/>
+            <w:tcW w:type="dxa" w:w="1192"/>
           </w:tcPr>
           <w:p>
             <w:pPr>
@@ -1909,13 +1919,13 @@
               <w:rPr>
                 <w:sz w:val="14"/>
               </w:rPr>
-              <w:t>Release 23 Sep 2026</w:t>
-            </w:r>
-          </w:p>
-        </w:tc>
-        <w:tc>
-          <w:tcPr>
-            <w:tcW w:type="dxa" w:w="1205"/>
+              <w:t>Release 23 Sep 2026; monthly releases, one used</w:t>
+            </w:r>
+          </w:p>
+        </w:tc>
+        <w:tc>
+          <w:tcPr>
+            <w:tcW w:type="dxa" w:w="1188"/>
           </w:tcPr>
           <w:p>
             <w:pPr>
@@ -1931,7 +1941,7 @@
         </w:tc>
         <w:tc>
           <w:tcPr>
-            <w:tcW w:type="dxa" w:w="1310"/>
+            <w:tcW w:type="dxa" w:w="1294"/>
           </w:tcPr>
           <w:p>
             <w:pPr>
@@ -1947,7 +1957,7 @@
         </w:tc>
         <w:tc>
           <w:tcPr>
-            <w:tcW w:type="dxa" w:w="2568"/>
+            <w:tcW w:type="dxa" w:w="2563"/>
           </w:tcPr>
           <w:p>
             <w:pPr>
@@ -1968,7 +1978,7 @@
         </w:trPr>
         <w:tc>
           <w:tcPr>
-            <w:tcW w:type="dxa" w:w="1415"/>
+            <w:tcW w:type="dxa" w:w="1400"/>
           </w:tcPr>
           <w:p>
             <w:pPr>
@@ -1984,7 +1994,7 @@
         </w:tc>
         <w:tc>
           <w:tcPr>
-            <w:tcW w:type="dxa" w:w="1547"/>
+            <w:tcW w:type="dxa" w:w="1533"/>
           </w:tcPr>
           <w:p>
             <w:pPr>
@@ -2000,7 +2010,7 @@
         </w:tc>
         <w:tc>
           <w:tcPr>
-            <w:tcW w:type="dxa" w:w="1125"/>
+            <w:tcW w:type="dxa" w:w="1192"/>
           </w:tcPr>
           <w:p>
             <w:pPr>
@@ -2016,7 +2026,7 @@
         </w:tc>
         <w:tc>
           <w:tcPr>
-            <w:tcW w:type="dxa" w:w="1205"/>
+            <w:tcW w:type="dxa" w:w="1188"/>
           </w:tcPr>
           <w:p>
             <w:pPr>
@@ -2032,7 +2042,7 @@
         </w:tc>
         <w:tc>
           <w:tcPr>
-            <w:tcW w:type="dxa" w:w="1310"/>
+            <w:tcW w:type="dxa" w:w="1294"/>
           </w:tcPr>
           <w:p>
             <w:pPr>
@@ -2048,7 +2058,7 @@
         </w:tc>
         <w:tc>
           <w:tcPr>
-            <w:tcW w:type="dxa" w:w="2568"/>
+            <w:tcW w:type="dxa" w:w="2563"/>
           </w:tcPr>
           <w:p>
             <w:pPr>
@@ -2079,7 +2089,7 @@
         </w:trPr>
         <w:tc>
           <w:tcPr>
-            <w:tcW w:type="dxa" w:w="1415"/>
+            <w:tcW w:type="dxa" w:w="1400"/>
           </w:tcPr>
           <w:p>
             <w:pPr>
@@ -2095,7 +2105,7 @@
         </w:tc>
         <w:tc>
           <w:tcPr>
-            <w:tcW w:type="dxa" w:w="1547"/>
+            <w:tcW w:type="dxa" w:w="1533"/>
           </w:tcPr>
           <w:p>
             <w:pPr>
@@ -2111,7 +2121,7 @@
         </w:tc>
         <w:tc>
           <w:tcPr>
-            <w:tcW w:type="dxa" w:w="1125"/>
+            <w:tcW w:type="dxa" w:w="1192"/>
           </w:tcPr>
           <w:p>
             <w:pPr>
@@ -2121,13 +2131,13 @@
               <w:rPr>
                 <w:sz w:val="14"/>
               </w:rPr>
-              <w:t>2015, 2020, 2026</w:t>
-            </w:r>
-          </w:p>
-        </w:tc>
-        <w:tc>
-          <w:tcPr>
-            <w:tcW w:type="dxa" w:w="1205"/>
+              <w:t>2015, 2020, 2026; annual series (2015–2030), three years used</w:t>
+            </w:r>
+          </w:p>
+        </w:tc>
+        <w:tc>
+          <w:tcPr>
+            <w:tcW w:type="dxa" w:w="1188"/>
           </w:tcPr>
           <w:p>
             <w:pPr>
@@ -2143,7 +2153,7 @@
         </w:tc>
         <w:tc>
           <w:tcPr>
-            <w:tcW w:type="dxa" w:w="1310"/>
+            <w:tcW w:type="dxa" w:w="1294"/>
           </w:tcPr>
           <w:p>
             <w:pPr>
@@ -2159,7 +2169,7 @@
         </w:tc>
         <w:tc>
           <w:tcPr>
-            <w:tcW w:type="dxa" w:w="2568"/>
+            <w:tcW w:type="dxa" w:w="2563"/>
           </w:tcPr>
           <w:p>
             <w:pPr>
@@ -2190,7 +2200,7 @@
         </w:trPr>
         <w:tc>
           <w:tcPr>
-            <w:tcW w:type="dxa" w:w="1415"/>
+            <w:tcW w:type="dxa" w:w="1400"/>
           </w:tcPr>
           <w:p>
             <w:pPr>
@@ -2206,7 +2216,7 @@
         </w:tc>
         <w:tc>
           <w:tcPr>
-            <w:tcW w:type="dxa" w:w="1547"/>
+            <w:tcW w:type="dxa" w:w="1533"/>
           </w:tcPr>
           <w:p>
             <w:pPr>
@@ -2222,7 +2232,7 @@
         </w:tc>
         <w:tc>
           <w:tcPr>
-            <w:tcW w:type="dxa" w:w="1125"/>
+            <w:tcW w:type="dxa" w:w="1192"/>
           </w:tcPr>
           <w:p>
             <w:pPr>
@@ -2232,13 +2242,13 @@
               <w:rPr>
                 <w:sz w:val="14"/>
               </w:rPr>
-              <w:t>Current release</w:t>
-            </w:r>
-          </w:p>
-        </w:tc>
-        <w:tc>
-          <w:tcPr>
-            <w:tcW w:type="dxa" w:w="1205"/>
+              <w:t>Current release; static</w:t>
+            </w:r>
+          </w:p>
+        </w:tc>
+        <w:tc>
+          <w:tcPr>
+            <w:tcW w:type="dxa" w:w="1188"/>
           </w:tcPr>
           <w:p>
             <w:pPr>
@@ -2254,7 +2264,7 @@
         </w:tc>
         <w:tc>
           <w:tcPr>
-            <w:tcW w:type="dxa" w:w="1310"/>
+            <w:tcW w:type="dxa" w:w="1294"/>
           </w:tcPr>
           <w:p>
             <w:pPr>
@@ -2270,7 +2280,7 @@
         </w:tc>
         <w:tc>
           <w:tcPr>
-            <w:tcW w:type="dxa" w:w="2568"/>
+            <w:tcW w:type="dxa" w:w="2563"/>
           </w:tcPr>
           <w:p>
             <w:pPr>
@@ -2301,7 +2311,7 @@
         </w:trPr>
         <w:tc>
           <w:tcPr>
-            <w:tcW w:type="dxa" w:w="1415"/>
+            <w:tcW w:type="dxa" w:w="1400"/>
           </w:tcPr>
           <w:p>
             <w:pPr>
@@ -2317,7 +2327,7 @@
         </w:tc>
         <w:tc>
           <w:tcPr>
-            <w:tcW w:type="dxa" w:w="1547"/>
+            <w:tcW w:type="dxa" w:w="1533"/>
           </w:tcPr>
           <w:p>
             <w:pPr>
@@ -2333,7 +2343,7 @@
         </w:tc>
         <w:tc>
           <w:tcPr>
-            <w:tcW w:type="dxa" w:w="1125"/>
+            <w:tcW w:type="dxa" w:w="1192"/>
           </w:tcPr>
           <w:p>
             <w:pPr>
@@ -2343,13 +2353,13 @@
               <w:rPr>
                 <w:sz w:val="14"/>
               </w:rPr>
-              <w:t>26 Aug 2026, 08:37:10 NPT</w:t>
-            </w:r>
-          </w:p>
-        </w:tc>
-        <w:tc>
-          <w:tcPr>
-            <w:tcW w:type="dxa" w:w="1205"/>
+              <w:t>26 Aug 2026, 08:37:10 NPT; single time, to the nearest second</w:t>
+            </w:r>
+          </w:p>
+        </w:tc>
+        <w:tc>
+          <w:tcPr>
+            <w:tcW w:type="dxa" w:w="1188"/>
           </w:tcPr>
           <w:p>
             <w:pPr>
@@ -2365,7 +2375,7 @@
         </w:tc>
         <w:tc>
           <w:tcPr>
-            <w:tcW w:type="dxa" w:w="1310"/>
+            <w:tcW w:type="dxa" w:w="1294"/>
           </w:tcPr>
           <w:p>
             <w:pPr>
@@ -2381,7 +2391,7 @@
         </w:tc>
         <w:tc>
           <w:tcPr>
-            <w:tcW w:type="dxa" w:w="2568"/>
+            <w:tcW w:type="dxa" w:w="2563"/>
           </w:tcPr>
           <w:p>
             <w:pPr>
@@ -2398,7 +2408,7 @@
                 <w:sz w:val="14"/>
                 <w:vertAlign w:val="superscript"/>
               </w:rPr>
-              <w:t>16,17</w:t>
+              <w:t>17,18</w:t>
             </w:r>
           </w:p>
         </w:tc>
@@ -2409,7 +2419,7 @@
         </w:trPr>
         <w:tc>
           <w:tcPr>
-            <w:tcW w:type="dxa" w:w="1415"/>
+            <w:tcW w:type="dxa" w:w="1400"/>
           </w:tcPr>
           <w:p>
             <w:pPr>
@@ -2419,13 +2429,13 @@
               <w:rPr>
                 <w:sz w:val="14"/>
               </w:rPr>
-              <w:t>Not used: DHM gauge observations</w:t>
-            </w:r>
-          </w:p>
-        </w:tc>
-        <w:tc>
-          <w:tcPr>
-            <w:tcW w:type="dxa" w:w="1547"/>
+              <w:t>DHM river levels</w:t>
+            </w:r>
+          </w:p>
+        </w:tc>
+        <w:tc>
+          <w:tcPr>
+            <w:tcW w:type="dxa" w:w="1533"/>
           </w:tcPr>
           <w:p>
             <w:pPr>
@@ -2435,13 +2445,13 @@
               <w:rPr>
                 <w:sz w:val="14"/>
               </w:rPr>
-              <w:t>Department of Hydrology and Meteorology API</w:t>
-            </w:r>
-          </w:p>
-        </w:tc>
-        <w:tc>
-          <w:tcPr>
-            <w:tcW w:type="dxa" w:w="1125"/>
+              <w:t>Department of Hydrology and Meteorology</w:t>
+            </w:r>
+          </w:p>
+        </w:tc>
+        <w:tc>
+          <w:tcPr>
+            <w:tcW w:type="dxa" w:w="1192"/>
           </w:tcPr>
           <w:p>
             <w:pPr>
@@ -2451,13 +2461,13 @@
               <w:rPr>
                 <w:sz w:val="14"/>
               </w:rPr>
-              <w:t>–</w:t>
-            </w:r>
-          </w:p>
-        </w:tc>
-        <w:tc>
-          <w:tcPr>
-            <w:tcW w:type="dxa" w:w="1205"/>
+              <w:t>Real-time level, 19 Oct 2026 (single reading)</w:t>
+            </w:r>
+          </w:p>
+        </w:tc>
+        <w:tc>
+          <w:tcPr>
+            <w:tcW w:type="dxa" w:w="1188"/>
           </w:tcPr>
           <w:p>
             <w:pPr>
@@ -2467,13 +2477,13 @@
               <w:rPr>
                 <w:sz w:val="14"/>
               </w:rPr>
-              <w:t>–</w:t>
-            </w:r>
-          </w:p>
-        </w:tc>
-        <w:tc>
-          <w:tcPr>
-            <w:tcW w:type="dxa" w:w="1310"/>
+              <w:t>Water level (m)</w:t>
+            </w:r>
+          </w:p>
+        </w:tc>
+        <w:tc>
+          <w:tcPr>
+            <w:tcW w:type="dxa" w:w="1294"/>
           </w:tcPr>
           <w:p>
             <w:pPr>
@@ -2483,13 +2493,13 @@
               <w:rPr>
                 <w:sz w:val="14"/>
               </w:rPr>
-              <w:t>Requests returned HTTP 403 (application key required)</w:t>
-            </w:r>
-          </w:p>
-        </w:tc>
-        <w:tc>
-          <w:tcPr>
-            <w:tcW w:type="dxa" w:w="2568"/>
+              <w:t>Post-monsoon base-flow level at Kali Khola; historical series not used (HTTP 403, application key required)</w:t>
+            </w:r>
+          </w:p>
+        </w:tc>
+        <w:tc>
+          <w:tcPr>
+            <w:tcW w:type="dxa" w:w="2563"/>
           </w:tcPr>
           <w:p>
             <w:pPr>
@@ -2514,7 +2524,7 @@
         </w:trPr>
         <w:tc>
           <w:tcPr>
-            <w:tcW w:type="dxa" w:w="1415"/>
+            <w:tcW w:type="dxa" w:w="1400"/>
           </w:tcPr>
           <w:p>
             <w:pPr>
@@ -2530,7 +2540,7 @@
         </w:tc>
         <w:tc>
           <w:tcPr>
-            <w:tcW w:type="dxa" w:w="1547"/>
+            <w:tcW w:type="dxa" w:w="1533"/>
           </w:tcPr>
           <w:p>
             <w:pPr>
@@ -2546,7 +2556,7 @@
         </w:tc>
         <w:tc>
           <w:tcPr>
-            <w:tcW w:type="dxa" w:w="1125"/>
+            <w:tcW w:type="dxa" w:w="1192"/>
           </w:tcPr>
           <w:p>
             <w:pPr>
@@ -2556,13 +2566,13 @@
               <w:rPr>
                 <w:sz w:val="14"/>
               </w:rPr>
-              <w:t>2021</w:t>
-            </w:r>
-          </w:p>
-        </w:tc>
-        <w:tc>
-          <w:tcPr>
-            <w:tcW w:type="dxa" w:w="1205"/>
+              <w:t>2021; single epoch</w:t>
+            </w:r>
+          </w:p>
+        </w:tc>
+        <w:tc>
+          <w:tcPr>
+            <w:tcW w:type="dxa" w:w="1188"/>
           </w:tcPr>
           <w:p>
             <w:pPr>
@@ -2578,7 +2588,7 @@
         </w:tc>
         <w:tc>
           <w:tcPr>
-            <w:tcW w:type="dxa" w:w="1310"/>
+            <w:tcW w:type="dxa" w:w="1294"/>
           </w:tcPr>
           <w:p>
             <w:pPr>
@@ -2594,7 +2604,7 @@
         </w:tc>
         <w:tc>
           <w:tcPr>
-            <w:tcW w:type="dxa" w:w="2568"/>
+            <w:tcW w:type="dxa" w:w="2563"/>
           </w:tcPr>
           <w:p>
             <w:pPr>
@@ -2625,7 +2635,7 @@
         </w:trPr>
         <w:tc>
           <w:tcPr>
-            <w:tcW w:type="dxa" w:w="1415"/>
+            <w:tcW w:type="dxa" w:w="1400"/>
           </w:tcPr>
           <w:p>
             <w:pPr>
@@ -2641,7 +2651,7 @@
         </w:tc>
         <w:tc>
           <w:tcPr>
-            <w:tcW w:type="dxa" w:w="1547"/>
+            <w:tcW w:type="dxa" w:w="1533"/>
           </w:tcPr>
           <w:p>
             <w:pPr>
@@ -2657,7 +2667,7 @@
         </w:tc>
         <w:tc>
           <w:tcPr>
-            <w:tcW w:type="dxa" w:w="1125"/>
+            <w:tcW w:type="dxa" w:w="1192"/>
           </w:tcPr>
           <w:p>
             <w:pPr>
@@ -2673,7 +2683,7 @@
         </w:tc>
         <w:tc>
           <w:tcPr>
-            <w:tcW w:type="dxa" w:w="1205"/>
+            <w:tcW w:type="dxa" w:w="1188"/>
           </w:tcPr>
           <w:p>
             <w:pPr>
@@ -2689,7 +2699,7 @@
         </w:tc>
         <w:tc>
           <w:tcPr>
-            <w:tcW w:type="dxa" w:w="1310"/>
+            <w:tcW w:type="dxa" w:w="1294"/>
           </w:tcPr>
           <w:p>
             <w:pPr>
@@ -2705,7 +2715,7 @@
         </w:tc>
         <w:tc>
           <w:tcPr>
-            <w:tcW w:type="dxa" w:w="2568"/>
+            <w:tcW w:type="dxa" w:w="2563"/>
           </w:tcPr>
           <w:p>
             <w:pPr>
@@ -13211,7 +13221,7 @@
       </w:r>
       <w:r>
         <w:rPr/>
-        <w:t xml:space="preserve"> † Bootstrap interval wider than 60 m; the core height uses the smaller of the 50% height and the 90th percentile of destroyed buildings before smoothing. Downstream of 114 km the envelope is interpolated between stage rises of 9.1 m at Kali Khola (172 km) and 2.6 m at Devghat (206.8 km) </w:t>
+        <w:t xml:space="preserve"> † Bootstrap interval wider than 60 m; the core height uses the smaller of the 50% height and the 90th percentile of destroyed buildings before smoothing. Downstream of 114 km the envelope is interpolated between peak stages above base flow of 9.1 m at Kali Khola (172 km; peak from CHWRR, base-flow level from the real-time record of the Department of Hydrology and Meteorology on 19 October 2026) and 2.6 m at Devghat (206.8 km) </w:t>
       </w:r>
       <w:r>
         <w:rPr>
@@ -25604,7 +25614,21 @@
     <w:p>
       <w:r>
         <w:rPr/>
-        <w:t xml:space="preserve">15. Otsu, N. A threshold selection method from gray-level histograms. </w:t>
+        <w:t xml:space="preserve">15. ICIMOD. Understanding the Gyirong–Rasuwa disaster of 26 August 2026: A preliminary synthesis. ICIMOD report (Kathmandu), ISBN 978-92-9115-983-3 (2026). </w:t>
+      </w:r>
+      <w:hyperlink r:id="rId53">
+        <w:r>
+          <w:rPr>
+            <w:color w:val="156080"/>
+          </w:rPr>
+          <w:t xml:space="preserve">https://doi.org/10.53055/ICIMOD.1150</w:t>
+        </w:r>
+      </w:hyperlink>
+    </w:p>
+    <w:p>
+      <w:r>
+        <w:rPr/>
+        <w:t xml:space="preserve">16. Otsu, N. A threshold selection method from gray-level histograms. </w:t>
       </w:r>
       <w:r>
         <w:rPr>
@@ -25626,7 +25650,7 @@
         <w:rPr/>
         <w:t xml:space="preserve">, 62–66 (1979). </w:t>
       </w:r>
-      <w:hyperlink r:id="rId53">
+      <w:hyperlink r:id="rId54">
         <w:r>
           <w:rPr>
             <w:color w:val="156080"/>
@@ -25638,7 +25662,7 @@
     <w:p>
       <w:r>
         <w:rPr/>
-        <w:t xml:space="preserve">16. Roy, P. et al. 26 August 2026 rock–ice avalanche in Nepal: rapid assessment of the cascading disaster using satellite data. </w:t>
+        <w:t xml:space="preserve">17. Roy, P. et al. 26 August 2026 rock–ice avalanche in Nepal: rapid assessment of the cascading disaster using satellite data. </w:t>
       </w:r>
       <w:r>
         <w:rPr>
@@ -25650,7 +25674,7 @@
         <w:rPr/>
         <w:t xml:space="preserve"> (2026). </w:t>
       </w:r>
-      <w:hyperlink r:id="rId54">
+      <w:hyperlink r:id="rId55">
         <w:r>
           <w:rPr>
             <w:color w:val="156080"/>
@@ -25662,9 +25686,9 @@
     <w:p>
       <w:r>
         <w:rPr/>
-        <w:t xml:space="preserve">17. Slaughter, S. et al. 2026 Nepal Debris Avalanche and Flash Flood. U.S. Geological Survey, Landslide Hazards Program (web page, 27-28 Aug 2026) (2026). </w:t>
+        <w:t xml:space="preserve">18. Slaughter, S. et al. 2026 Nepal Debris Avalanche and Flash Flood. U.S. Geological Survey, Landslide Hazards Program (web page, 27-28 Aug 2026) (2026). </w:t>
       </w:r>
-      <w:hyperlink r:id="rId55">
+      <w:hyperlink r:id="rId56">
         <w:r>
           <w:rPr>
             <w:color w:val="156080"/>
@@ -25676,9 +25700,9 @@
     <w:p>
       <w:r>
         <w:rPr/>
-        <w:t xml:space="preserve">18. Zanaga, D. et al. ESA WorldCover 10 m 2021 v200. Zenodo (dataset) (2022). </w:t>
+        <w:t xml:space="preserve">19. Zanaga, D. et al. ESA WorldCover 10 m 2021 v200. Zenodo (dataset) (2022). </w:t>
       </w:r>
-      <w:hyperlink r:id="rId56">
+      <w:hyperlink r:id="rId57">
         <w:r>
           <w:rPr>
             <w:color w:val="156080"/>
@@ -25690,7 +25714,7 @@
     <w:p>
       <w:r>
         <w:rPr/>
-        <w:t xml:space="preserve">19. World Bank &amp; Global Facility for Disaster Reduction and Recovery (GFDRR). Global Rapid Post-Disaster Damage Estimation (GRADE) Report: Rasuwa Flash Flood, Nepal. World Bank Report No. 215321 (Washington, DC) (2026). </w:t>
+        <w:t xml:space="preserve">20. World Bank &amp; Global Facility for Disaster Reduction and Recovery (GFDRR). Global Rapid Post-Disaster Damage Estimation (GRADE) Report: Rasuwa Flash Flood, Nepal. World Bank Report No. 215321 (Washington, DC) (2026). </w:t>
       </w:r>
       <w:hyperlink r:id="rId37">
         <w:r>

</xml_diff>